<commit_message>
Publish Totem Sep15 2026 release
</commit_message>
<xml_diff>
--- a/docs/Totem_User_Manual.docx
+++ b/docs/Totem_User_Manual.docx
@@ -238,7 +238,7 @@
                 <w:rFonts w:ascii="Aptos" w:hAnsi="Aptos"/>
                 <w:color w:val="12181B"/>
               </w:rPr>
-              <w:t>August 23, 2026</w:t>
+              <w:t>September 15, 2026</w:t>
             </w:r>
           </w:p>
         </w:tc>
@@ -306,7 +306,7 @@
                 <w:rFonts w:ascii="Aptos" w:hAnsi="Aptos"/>
                 <w:color w:val="12181B"/>
               </w:rPr>
-              <w:t>Aug23-2026</w:t>
+              <w:t>Sep15-2026</w:t>
             </w:r>
           </w:p>
         </w:tc>
@@ -374,7 +374,7 @@
                 <w:rFonts w:ascii="Aptos" w:hAnsi="Aptos"/>
                 <w:color w:val="12181B"/>
               </w:rPr>
-              <w:t>2026.08.23-guest</w:t>
+              <w:t>2026.09.15-guest</w:t>
             </w:r>
           </w:p>
         </w:tc>
@@ -510,7 +510,7 @@
                 <w:rFonts w:ascii="Aptos" w:hAnsi="Aptos"/>
                 <w:color w:val="12181B"/>
               </w:rPr>
-              <w:t>totem-release-aug23-2026.apk</w:t>
+              <w:t>totem-release-sep15-2026.apk</w:t>
             </w:r>
           </w:p>
         </w:tc>
@@ -733,7 +733,7 @@
     </w:p>
     <w:p>
       <w:r>
-        <w:t>Totem is experimental smartphone GNSS positioning software for Android field use. It is designed as a deployable toolbox that connects Android raw GNSS collection, correction handling, native-engine SPP/RTK processing, map-based monitoring, local replay, and exportable session packages.</w:t>
+        <w:t>Totem is experimental smartphone GNSS positioning software for Android field use. It is designed as a deployable toolbox that connects Android raw GNSS collection, correction handling, native-engine SPP, SPK, RTK, and DSPP processing, map-based monitoring, local replay, and exportable session packages.</w:t>
       </w:r>
     </w:p>
     <w:p>
@@ -817,7 +817,7 @@
               <w:spacing w:after="0"/>
             </w:pPr>
             <w:r>
-              <w:t>Collect Android raw GNSS data, monitor the phone solution, and run the embedded SPP/RTK engine.</w:t>
+              <w:t>Collect Android raw GNSS data, monitor the phone solution, and run the embedded SPP, SPK, RTK, and DSPP engine.</w:t>
             </w:r>
           </w:p>
         </w:tc>
@@ -927,14 +927,10 @@
         <w:pStyle w:val="ListNumber"/>
       </w:pPr>
       <w:r>
-        <w:t xml:space="preserve">Install the APK from the release package or with ADB: adb install -r </w:t>
+        <w:t>Install the APK from the release package or with ADB: adb install -r totem-release-sep15-2026.apk.</w:t>
       </w:r>
-      <w:r>
-        <w:t>totem-release-aug23-2026.apk</w:t>
-      </w:r>
-      <w:r>
-        <w:t>.</w:t>
-      </w:r>
+      <w:r/>
+      <w:r/>
     </w:p>
     <w:p>
       <w:pPr>
@@ -1592,7 +1588,7 @@
               <w:spacing w:after="0"/>
             </w:pPr>
             <w:r>
-              <w:t>Displays the Android device positioning solution and the phone-reported accuracy. Accuracy below 1 m is shown as &lt;1 m.</w:t>
+              <w:t>Displays the selected Android or TCP phone solution. The directional STD table uses the phone marker glyph when enabled.</w:t>
             </w:r>
           </w:p>
         </w:tc>
@@ -1622,7 +1618,7 @@
               <w:spacing w:after="0"/>
             </w:pPr>
             <w:r>
-              <w:t>Displays the Totem solution. When prediction is enabled, the displayed marker follows the predicted Totem position.</w:t>
+              <w:t>Displays the Totem solution using the active solution-type color. Prediction moves the live marker while measured epochs remain in the track.</w:t>
             </w:r>
           </w:p>
         </w:tc>
@@ -1652,7 +1648,7 @@
               <w:spacing w:after="0"/>
             </w:pPr>
             <w:r>
-              <w:t>Explains phone and Totem marker colors and shows solution-type counts/percentages for nonzero Totem solution types.</w:t>
+              <w:t>The compact legend identifies marker colors and shows 3D Phone/Totem STD. Solution-type counts appear only when enabled and nonzero.</w:t>
             </w:r>
           </w:p>
         </w:tc>
@@ -1802,7 +1798,29 @@
               <w:spacing w:after="0"/>
             </w:pPr>
             <w:r>
-              <w:t>Controls prediction animation, general animation, map provider, satellite map style, and display preferences.</w:t>
+              <w:t>Controls prediction, animation, map provider/style, directional STD, reference error, compact legend, rotation, and location-source preferences.</w:t>
+            </w:r>
+          </w:p>
+        </w:tc>
+      </w:tr>
+      <w:tr>
+        <w:tc>
+          <w:tcPr>
+            <w:tcW w:type="dxa" w:w="2088"/>
+          </w:tcPr>
+          <w:p>
+            <w:r>
+              <w:t>Reference marker and error table</w:t>
+            </w:r>
+          </w:p>
+        </w:tc>
+        <w:tc>
+          <w:tcPr>
+            <w:tcW w:type="dxa" w:w="8136"/>
+          </w:tcPr>
+          <w:p>
+            <w:r>
+              <w:t>Displays a selected reference source and the nearest epoch-aligned Phone/Totem East, North, and Up errors when enabled.</w:t>
             </w:r>
           </w:p>
         </w:tc>
@@ -2591,7 +2609,7 @@
               <w:spacing w:after="0"/>
             </w:pPr>
             <w:r>
-              <w:t>SPP/RTK processing mode and solution behavior.</w:t>
+              <w:t>SPP, SPK, RTK, and DSPP processing mode and solution behavior.</w:t>
             </w:r>
           </w:p>
         </w:tc>
@@ -3469,7 +3487,7 @@
         <w:pStyle w:val="Heading2"/>
       </w:pPr>
       <w:r>
-        <w:t>Real-time RTK/SPP field workflow</w:t>
+        <w:t>Real-time SPP/SPK/RTK/DSPP field workflow</w:t>
       </w:r>
     </w:p>
     <w:p>
@@ -3485,7 +3503,7 @@
         <w:pStyle w:val="ListNumber"/>
       </w:pPr>
       <w:r>
-        <w:t>Open Options and confirm correction source, map provider, prediction/animation, and ambiguity-resolution preference.</w:t>
+        <w:t>Open Options and confirm the processing mode, broadcast ephemeris, any required correction/base source, map provider, and display preferences.</w:t>
       </w:r>
     </w:p>
     <w:p>
@@ -3656,7 +3674,7 @@
               <w:spacing w:after="0"/>
             </w:pPr>
             <w:r>
-              <w:t>Confirm Collect is on, Measurements is nonzero, correction source is configured, and the engine is running.</w:t>
+              <w:t>Confirm Collect is on, Measurements is nonzero, broadcast ephemeris is available, any required RTK/DSPP correction stream is configured, and the engine is running.</w:t>
             </w:r>
           </w:p>
         </w:tc>
@@ -3771,7 +3789,7 @@
         </w:rPr>
         <w:drawing>
           <wp:inline distT="0" distB="0" distL="0" distR="0" wp14:anchorId="0C7D0E32" wp14:editId="34965188">
-            <wp:extent cx="4800600" cy="5120640"/>
+            <wp:extent cx="4389120" cy="4681728"/>
             <wp:effectExtent l="0" t="0" r="0" b="0"/>
             <wp:docPr id="4" name="Picture 4"/>
             <wp:cNvGraphicFramePr>
@@ -3793,7 +3811,7 @@
                   <pic:spPr>
                     <a:xfrm>
                       <a:off x="0" y="0"/>
-                      <a:ext cx="4800600" cy="5120640"/>
+                      <a:ext cx="4389120" cy="4681728"/>
                     </a:xfrm>
                     <a:prstGeom prst="rect">
                       <a:avLst/>
@@ -4111,6 +4129,50 @@
             </w:pPr>
             <w:r>
               <w:t>Correction/base data format used by many network or local correction sources.</w:t>
+            </w:r>
+          </w:p>
+        </w:tc>
+      </w:tr>
+      <w:tr>
+        <w:tc>
+          <w:tcPr>
+            <w:tcW w:type="dxa" w:w="1800"/>
+          </w:tcPr>
+          <w:p>
+            <w:r>
+              <w:t>SPK</w:t>
+            </w:r>
+          </w:p>
+        </w:tc>
+        <w:tc>
+          <w:tcPr>
+            <w:tcW w:type="dxa" w:w="8424"/>
+          </w:tcPr>
+          <w:p>
+            <w:r>
+              <w:t>Standard Point Kinematic positioning for sequential phone observations without a base stream.</w:t>
+            </w:r>
+          </w:p>
+        </w:tc>
+      </w:tr>
+      <w:tr>
+        <w:tc>
+          <w:tcPr>
+            <w:tcW w:type="dxa" w:w="1800"/>
+          </w:tcPr>
+          <w:p>
+            <w:r>
+              <w:t>DSPP</w:t>
+            </w:r>
+          </w:p>
+        </w:tc>
+        <w:tc>
+          <w:tcPr>
+            <w:tcW w:type="dxa" w:w="8424"/>
+          </w:tcPr>
+          <w:p>
+            <w:r>
+              <w:t>Differential SPP using rover observations together with a correction/base stream.</w:t>
             </w:r>
           </w:p>
         </w:tc>
@@ -4192,14 +4254,13 @@
         <w:color w:val="646D70"/>
         <w:sz w:val="16"/>
       </w:rPr>
-      <w:t xml:space="preserve">Experimental Smartphone GNSS Positioning Software | </w:t>
+      <w:t>Experimental Smartphone GNSS Positioning Software | Sep15-2026</w:t>
     </w:r>
     <w:r>
       <w:rPr>
         <w:color w:val="646D70"/>
         <w:sz w:val="16"/>
       </w:rPr>
-      <w:t>Aug23-2026</w:t>
     </w:r>
   </w:p>
 </w:ftr>

</xml_diff>